<commit_message>
docs: kế hoạch bản 3 — chấm theo nội dung, SAV có neo nguồn, đối chứng B2, Beats; mã kiểm neo + test
</commit_message>
<xml_diff>
--- a/Đọc_báo_cùng_HuP_4_.docx
+++ b/Đọc_báo_cùng_HuP_4_.docx
@@ -728,16 +728,56 @@
                 <w:szCs w:val="26"/>
                 <w:rtl w:val="0"/>
               </w:rPr>
-              <w:t xml:space="preserve">Đóng góp cốt lõi — thuật toán đối chiếu nhận biết phạm vi thông số (SAV, Scope-Aware Verification):</w:t>
-            </w:r>
-            <w:r>
-              <w:rPr>
-                <w:rFonts w:ascii="Times New Roman" w:cs="Times New Roman" w:eastAsia="Times New Roman" w:hAnsi="Times New Roman"/>
-                <w:sz w:val="26"/>
-                <w:szCs w:val="26"/>
-                <w:rtl w:val="0"/>
-              </w:rPr>
-              <w:t xml:space="preserve"> mỗi claim và mỗi dữ kiện nguồn được biểu diễn thành bộ phạm vi σ = ⟨sản phẩm, phiên bản, bộ phận, thuộc tính, điều kiện thử, vai trò con số, giá trị, đơn vị⟩; bộ quyết định kiểm từng chiều phạm vi với kết quả ba trạng thái, coi lệch phạm vi là bằng chứng không dùng được (dẫn tới NEI) thay vì bác bỏ, kế thừa điều kiện tiêu đề có kiểm soát, và chỉ so giá trị theo bảng vai trò × vai trò khi mọi chiều đã khớp.</w:t>
+              <w:t xml:space="preserve">Đóng góp cốt lõi — phương pháp kiểm chứng nhận biết phạm vi thông số (SAV, Scope-Aware Verification)</w:t>
+            </w:r>
+            <w:r>
+              <w:rPr>
+                <w:rFonts w:ascii="Times New Roman" w:cs="Times New Roman" w:eastAsia="Times New Roman" w:hAnsi="Times New Roman"/>
+                <w:sz w:val="26"/>
+                <w:szCs w:val="26"/>
+                <w:rtl w:val="0"/>
+              </w:rPr>
+              <w:t xml:space="preserve">, gồm hai thành phần trên cùng biểu diễn σ = ⟨sản phẩm, phiên bản, bộ phận, thuộc tính, điều kiện thử, vai trò con số, giá trị, đơn vị⟩: (1) </w:t>
+            </w:r>
+            <w:r>
+              <w:rPr>
+                <w:rFonts w:ascii="Times New Roman" w:cs="Times New Roman" w:eastAsia="Times New Roman" w:hAnsi="Times New Roman"/>
+                <w:b w:val="1"/>
+                <w:bCs w:val="1"/>
+                <w:sz w:val="26"/>
+                <w:szCs w:val="26"/>
+                <w:rtl w:val="0"/>
+              </w:rPr>
+              <w:t xml:space="preserve">trích xuất σ có neo nguồn</w:t>
+            </w:r>
+            <w:r>
+              <w:rPr>
+                <w:rFonts w:ascii="Times New Roman" w:cs="Times New Roman" w:eastAsia="Times New Roman" w:hAnsi="Times New Roman"/>
+                <w:sz w:val="26"/>
+                <w:szCs w:val="26"/>
+                <w:rtl w:val="0"/>
+              </w:rPr>
+              <w:t xml:space="preserve"> — LLM phải kèm chuỗi nguyên văn cho giá trị, điều kiện và bộ phận; bộ kiểm tất định xác nhận chuỗi có trong đoạn, con số khớp và vai trò con số khớp từ chỉ vai trò, trường không neo được thì loại dữ kiện; (2) </w:t>
+            </w:r>
+            <w:r>
+              <w:rPr>
+                <w:rFonts w:ascii="Times New Roman" w:cs="Times New Roman" w:eastAsia="Times New Roman" w:hAnsi="Times New Roman"/>
+                <w:b w:val="1"/>
+                <w:bCs w:val="1"/>
+                <w:sz w:val="26"/>
+                <w:szCs w:val="26"/>
+                <w:rtl w:val="0"/>
+              </w:rPr>
+              <w:t xml:space="preserve">bộ quyết định nhận biết phạm vi</w:t>
+            </w:r>
+            <w:r>
+              <w:rPr>
+                <w:rFonts w:ascii="Times New Roman" w:cs="Times New Roman" w:eastAsia="Times New Roman" w:hAnsi="Times New Roman"/>
+                <w:sz w:val="26"/>
+                <w:szCs w:val="26"/>
+                <w:rtl w:val="0"/>
+              </w:rPr>
+              <w:t xml:space="preserve"> — kiểm từng chiều σ với kết quả ba trạng thái, coi lệch phạm vi là bằng chứng không dùng được (dẫn tới NEI) thay vì bác bỏ, kế thừa điều kiện tiêu đề có kiểm soát, và chỉ so giá trị theo bảng vai trò × vai trò khi mọi chiều đã khớp.</w:t>
             </w:r>
           </w:p>
         </w:tc>
@@ -830,7 +870,7 @@
                 <w:szCs w:val="26"/>
                 <w:rtl w:val="0"/>
               </w:rPr>
-              <w:t xml:space="preserve">M1. Đề xuất và đặc tả thuật toán SAV: định nghĩa bộ phạm vi σ, quy tắc kiểm từng chiều, chính sách kế thừa điều kiện và bảng so sánh theo vai trò con số; cài đặt có kiểm thử đơn vị.</w:t>
+              <w:t xml:space="preserve">M1. Đề xuất và đặc tả SAV: định nghĩa bộ phạm vi σ, quy tắc neo nguồn theo từng trường, quy tắc kiểm từng chiều, chính sách kế thừa điều kiện và bảng so sánh theo vai trò con số; cài đặt có kiểm thử đơn vị.</w:t>
             </w:r>
           </w:p>
         </w:tc>
@@ -877,7 +917,7 @@
                 <w:szCs w:val="26"/>
                 <w:rtl w:val="0"/>
               </w:rPr>
-              <w:t xml:space="preserve">M2. Xây dựng bước trích xuất σ bằng LLM theo schema cố định và truy hồi bằng chứng BM25 lọc theo sản phẩm để SAV chạy trên văn bản nguồn thật.</w:t>
+              <w:t xml:space="preserve">M2. Xây dựng bước trích xuất σ có neo nguồn bằng LLM theo schema cố định và truy hồi bằng chứng BM25 lọc theo sản phẩm để SAV chạy trên văn bản nguồn thật.</w:t>
             </w:r>
           </w:p>
         </w:tc>
@@ -924,7 +964,7 @@
                 <w:szCs w:val="26"/>
                 <w:rtl w:val="0"/>
               </w:rPr>
-              <w:t xml:space="preserve">M3. Đánh giá SAV so với LLM quyết định trên </w:t>
+              <w:t xml:space="preserve">M3. Đánh giá SAV so với LLM có danh sách kiểm phạm vi (B2), LLM tự quyết định (B1) — cả hai nhận </w:t>
             </w:r>
             <w:r>
               <w:rPr>
@@ -944,7 +984,7 @@
                 <w:szCs w:val="26"/>
                 <w:rtl w:val="0"/>
               </w:rPr>
-              <w:t xml:space="preserve"> hồ sơ σ (B1) và LLM đọc văn bản thô (B0), trên tập claim quảng cáo LLM và tập chẩn đoán cặp tối thiểu theo từng chiều phạm vi; phân tích thành phần và đánh giá trên hồ sơ chuẩn để tách lỗi trích xuất khỏi lỗi quyết định.</w:t>
+              <w:t xml:space="preserve"> hồ sơ σ đã neo — và LLM đọc văn bản thô (B0), với hai mô hình quyết định, trên tập claim quảng cáo LLM và tập chẩn đoán cặp tối thiểu theo từng chiều phạm vi; phân tích thành phần (gồm bỏ bước neo) và đánh giá trên hồ sơ chuẩn để tách lỗi trích xuất khỏi lỗi quyết định.</w:t>
             </w:r>
           </w:p>
         </w:tc>
@@ -991,7 +1031,7 @@
                 <w:szCs w:val="26"/>
                 <w:rtl w:val="0"/>
               </w:rPr>
-              <w:t xml:space="preserve">M4. Chuẩn bị dữ liệu cần cho phép đo (sản phẩm hỗ trợ, không phải đóng góp): kho tài liệu chính thức có snapshot và mã băm cho ≥ 6 họ sản phẩm, tập claim tiếng Việt có nguồn gốc truy vết, hướng dẫn gán nhãn dùng chung cho người gán, B0, B1 và SAV.</w:t>
+              <w:t xml:space="preserve">M4. Chuẩn bị dữ liệu cần cho phép đo (sản phẩm hỗ trợ, không phải đóng góp): kho tài liệu chính thức có snapshot và mã băm cho 10 họ sản phẩm AirPods và Beats (tối thiểu 6), tập claim tiếng Việt có nguồn gốc truy vết, hướng dẫn gán nhãn dùng chung cho người gán, B0, B1 và SAV.</w:t>
             </w:r>
           </w:p>
         </w:tc>
@@ -1044,7 +1084,7 @@
                 <w:szCs w:val="26"/>
                 <w:rtl w:val="0"/>
               </w:rPr>
-              <w:t xml:space="preserve"> claim về thời lượng pin, thời gian sạc, phiên bản Bluetooth, chống nước/bụi, chống ồn và các thông số có số liệu trên tài liệu chính thức của hãng (Apple và, nếu thu được, một hãng khác). Đầu vào là claim đã tách thủ công và mã sản phẩm đang quảng cáo. Không thuộc phạm vi: tách claim tự động, tự nhận diện sản phẩm, kho gây nhiễu nhiều sản phẩm, mô hình thứ hai, giao diện web.</w:t>
+              <w:t xml:space="preserve"> claim về thời lượng pin, thời gian sạc, phiên bản Bluetooth, chống nước/bụi, chống ồn và các thông số có số liệu trên tài liệu chính thức của hãng (AirPods của Apple và Beats; thêm hãng độc lập nếu thu được trang thông số văn bản). Đầu vào là claim đã tách thủ công và mã sản phẩm đang quảng cáo. Không thuộc phạm vi: tách claim tự động, tự nhận diện sản phẩm, kho gây nhiễu nhiều sản phẩm, mô hình thứ hai, giao diện web.</w:t>
             </w:r>
           </w:p>
         </w:tc>
@@ -1389,7 +1429,7 @@
                 <w:szCs w:val="26"/>
                 <w:rtl w:val="0"/>
               </w:rPr>
-              <w:t xml:space="preserve">ProgramFC [14] và FOLK [15] phân rã claim thành chương trình/vị từ, nhưng từng bước vẫn do LLM trả lời tự do, không có schema phạm vi cố định.</w:t>
+              <w:t xml:space="preserve">ProgramFC [14] và FOLK [15] phân rã claim thành chương trình/vị từ, nhưng từng bước vẫn do LLM trả lời tự do, không neo vào nguồn và không có schema phạm vi cố định.</w:t>
             </w:r>
           </w:p>
         </w:tc>
@@ -1447,7 +1487,7 @@
                 <w:szCs w:val="26"/>
                 <w:rtl w:val="0"/>
               </w:rPr>
-              <w:t xml:space="preserve"> vai trò con số và điều kiện thử là chiều phạm vi bắt buộc; lệch phạm vi không bị suy thành bác bỏ; so sánh theo bảng vai trò × vai trò. Trong các tài liệu đã khảo sát chưa thấy cách làm này cho thông số sản phẩm; nhận định sẽ được kiểm lại khi đọc toàn văn các bài [12]–[16] ở giai đoạn 1.</w:t>
+              <w:t xml:space="preserve"> vai trò con số và điều kiện thử là chiều phạm vi bắt buộc; hồ sơ do LLM trích được neo vào văn bản nguồn theo từng chiều trước khi quyết định; lệch phạm vi không bị suy thành bác bỏ; so sánh theo bảng vai trò × vai trò. Trong các tài liệu đã khảo sát chưa thấy cách làm này cho thông số sản phẩm; nhận định sẽ được kiểm lại khi đọc toàn văn các bài [12]–[16] ở giai đoạn 1.</w:t>
             </w:r>
           </w:p>
         </w:tc>
@@ -1669,7 +1709,7 @@
                 <w:szCs w:val="26"/>
                 <w:rtl w:val="0"/>
               </w:rPr>
-              <w:t xml:space="preserve"> trên cùng hồ sơ σ, SAV có giảm tỷ lệ chấp nhận nhầm (FAR) so với B1, đặc biệt trên claim lệch phạm vi, mà vẫn giữ Recall Supported? (TN2).</w:t>
+              <w:t xml:space="preserve"> trên cùng hồ sơ σ đã neo, SAV có giảm tỷ lệ chấp nhận nhầm (FAR) so với LLM có danh sách kiểm phạm vi (B2) và LLM tự do (B1), đặc biệt trên claim lệch phạm vi, mà vẫn giữ Recall Supported, với cả hai mô hình quyết định? (TN2).</w:t>
             </w:r>
           </w:p>
         </w:tc>
@@ -1727,7 +1767,7 @@
                 <w:szCs w:val="26"/>
                 <w:rtl w:val="0"/>
               </w:rPr>
-              <w:t xml:space="preserve"> chiều nào của σ tạo ra khác biệt, và còn bao nhiêu khi bỏ lỗi trích xuất? (TN3 — tắt từng chiều; TN4 — hồ sơ chuẩn).</w:t>
+              <w:t xml:space="preserve"> thành phần nào tạo ra khác biệt — từng chiều của bộ quyết định và bước neo nguồn — và còn bao nhiêu khi bỏ hẳn lỗi trích xuất? (TN3 — tắt từng thành phần; TN4 — hồ sơ chuẩn).</w:t>
             </w:r>
           </w:p>
         </w:tc>
@@ -1894,7 +1934,7 @@
                 <w:szCs w:val="26"/>
                 <w:rtl w:val="0"/>
               </w:rPr>
-              <w:t xml:space="preserve">Quy mô dự kiến, chốt sau pilot: dev 3–4 họ (40–60 claim thông thường, 20–30 biến thể); val 2 họ (15–25; 10–15); test 5 họ, tối thiểu 4 (60–80; 60–75, ≥ 12 mỗi loại thao tác). Sàn test: R+NEI ≥ 40, S ≥ 20, ≥ 8 ca mỗi loại COND/PART/ROLE.</w:t>
+              <w:t xml:space="preserve">Quy mô dự kiến, chốt sau pilot: dev 3 họ (30–40 claim thông thường, 20–30 biến thể); val 2 họ (12–15; 10–15); test 5 họ, ít nhất 2 họ Beats (40–60; 60–75, ≥ 12 mỗi loại thao tác). Tổng ≈ 170–235 claim, hơn một nửa là biến thể dùng lại bằng chứng của câu cha. Sàn test: R+NEI ≥ 40, S ≥ 20, ≥ 8 ca mỗi loại COND/PART/ROLE.</w:t>
             </w:r>
           </w:p>
         </w:tc>
@@ -2061,7 +2101,7 @@
                 <w:szCs w:val="26"/>
                 <w:rtl w:val="0"/>
               </w:rPr>
-              <w:t xml:space="preserve">Claim + mã sản phẩm → BM25 lấy top-k đoạn của đúng sản phẩm → LLM trích hồ sơ σ cho claim và từng đoạn → chuẩn hóa đơn vị → SAV → nhãn, mã bằng chứng, lý do, dấu vết từng chiều.</w:t>
+              <w:t xml:space="preserve">Claim + mã sản phẩm → BM25 lấy top-k đoạn của đúng sản phẩm → LLM trích hồ sơ σ kèm chuỗi nguyên văn → kiểm neo nguồn (loại dữ kiện không neo được) → chuẩn hóa đơn vị → bộ quyết định → nhãn, mã bằng chứng, dữ kiện bị loại, dấu vết từng chiều.</w:t>
             </w:r>
           </w:p>
         </w:tc>
@@ -2249,7 +2289,7 @@
                 <w:szCs w:val="26"/>
                 <w:rtl w:val="0"/>
               </w:rPr>
-              <w:t xml:space="preserve">Đối chứng: B1 nhận đúng hồ sơ σ của SAV và cùng hướng dẫn nhãn rồi để LLM quyết định — hiệu SAV − B1 đo riêng tác động của cách quyết định; B0 đọc văn bản thô, chỉ để tham khảo.</w:t>
+              <w:t xml:space="preserve">Đối chứng: B1 nhận đúng hồ sơ σ đã neo của SAV và cùng hướng dẫn nhãn rồi để LLM quyết định; B2 như B1 nhưng có thêm danh sách kiểm phạm vi (sản phẩm → bộ phận → điều kiện → vai trò con số → giá trị) và 3 ví dụ từ dev — đối chứng mạnh nhất bằng prompt, nên so sánh chính là SAV − B2; B0 đọc văn bản thô, chỉ để tham khảo. Phần quyết định của B0/B1/B2 chạy trên hai mô hình: một mô hình mở (họ Llama) và một mô hình thương mại cỡ nhỏ.</w:t>
             </w:r>
           </w:p>
         </w:tc>
@@ -2369,7 +2409,7 @@
                 <w:szCs w:val="26"/>
                 <w:rtl w:val="0"/>
               </w:rPr>
-              <w:t xml:space="preserve">TN1: recall@k của BM25 trên test. TN2: B0, B1, SAV trên toàn test; lượt 1 là bảng chính, lượt 2–3 trên min(30, n_test) claim chọn trước. TN3: SAV tắt lần lượt kiểm bộ phận, điều kiện, vai trò con số, kế thừa điều kiện, trên cùng hồ sơ lượt 1. TN4: SAV và B1 trên hồ sơ chuẩn viết tay cho tập chẩn đoán test.</w:t>
+              <w:t xml:space="preserve">TN1: recall@k của BM25 trên test. TN2: B0, B1, B2, SAV × hai mô hình quyết định trên toàn test; lượt 1 là bảng chính, lượt 2–3 trên min(30, n_test) claim chọn trước. TN3: SAV tắt lần lượt kiểm bộ phận, điều kiện, vai trò con số, kế thừa điều kiện và bước neo nguồn (P−ground), trên cùng lượt trích xuất 1. TN4: SAV, B1, B2 trên hồ sơ chuẩn viết tay cho tập chẩn đoán test.</w:t>
             </w:r>
           </w:p>
         </w:tc>
@@ -2474,7 +2514,7 @@
                 <w:szCs w:val="26"/>
                 <w:rtl w:val="0"/>
               </w:rPr>
-              <w:t xml:space="preserve"> trên tập chẩn đoán test, ΔFAR = FAR_SAV − FAR_B1 &lt; 0 ở lượt 1, cùng chiều ở các lượt lặp, cặp bất đồng nghiêng về SAV, ΔRecall Supported ≥ −10 điểm phần trăm, và ablation tương ứng làm FAR tăng ở đúng loại thao tác. Thiếu một điều kiện → “chưa kết luận”.</w:t>
+              <w:t xml:space="preserve"> trên tập chẩn đoán test, ΔFAR = FAR_SAV − FAR_B2 &lt; 0 ở lượt 1 với cả hai mô hình, cùng chiều ở các lượt lặp, cặp bất đồng nghiêng về SAV (McNemar ghép cặp), ΔRecall Supported ≥ −10 điểm phần trăm, và ablation tương ứng làm FAR tăng ở đúng loại thao tác. Thiếu một điều kiện → “chưa kết luận”. Bước neo nguồn có tác dụng khi P−ground có FAR cao hơn SAV trên hồ sơ trích và khoảng cách gần như mất trên hồ sơ chuẩn.</w:t>
             </w:r>
           </w:p>
         </w:tc>
@@ -2521,7 +2561,7 @@
                 <w:szCs w:val="26"/>
                 <w:rtl w:val="0"/>
               </w:rPr>
-              <w:t xml:space="preserve">Khi kết quả âm, TN4 phân biệt: trích xuất làm mất thông tin phạm vi, luật sai/thiếu, hoặc B1 đã đủ tốt. Mọi trường hợp đều được báo cáo.</w:t>
+              <w:t xml:space="preserve">Khi kết quả âm, TN4 phân biệt: trích xuất làm mất thông tin phạm vi, luật sai/thiếu, hoặc B2 đã đủ tốt. Mọi trường hợp đều được báo cáo.</w:t>
             </w:r>
           </w:p>
         </w:tc>
@@ -2660,7 +2700,7 @@
                 <w:szCs w:val="26"/>
                 <w:rtl w:val="0"/>
               </w:rPr>
-              <w:t xml:space="preserve">Đặc tả và mã nguồn thuật toán SAV có kiểm thử; bước trích xuất σ và truy hồi BM25 chạy trên tài liệu thật.</w:t>
+              <w:t xml:space="preserve">Đặc tả và mã nguồn SAV (kiểm neo nguồn và bộ quyết định) có kiểm thử; bước trích xuất σ và truy hồi BM25 chạy trên tài liệu thật.</w:t>
             </w:r>
           </w:p>
         </w:tc>
@@ -2853,7 +2893,7 @@
                 <w:szCs w:val="26"/>
                 <w:rtl w:val="0"/>
               </w:rPr>
-              <w:t xml:space="preserve"> một sinh viên thực hiện; các giai đoạn nối tiếp, giai đoạn sau chỉ bắt đầu khi giai đoạn trước đạt mốc kiểm tra. Ước lượng ≈ 222–350 giờ (≈ 19–29 giờ/tuần). Danh sách 52 bước chi tiết ở sổ tay thực hiện kèm theo.</w:t>
+              <w:t xml:space="preserve"> một sinh viên thực hiện; các giai đoạn nối tiếp, giai đoạn sau chỉ bắt đầu khi giai đoạn trước đạt mốc kiểm tra. Ước lượng ≈ 208–320 giờ (≈ 17–27 giờ/tuần). Danh sách 52 bước chi tiết ở sổ tay thực hiện kèm theo.</w:t>
             </w:r>
           </w:p>
         </w:tc>
@@ -3147,7 +3187,7 @@
                 <w:szCs w:val="26"/>
                 <w:rtl w:val="0"/>
               </w:rPr>
-              <w:t xml:space="preserve">Thu tài liệu chính thức, snapshot, trích văn bản, chia đoạn, kiểm độ phủ.</w:t>
+              <w:t xml:space="preserve">Kiểm kê 10 họ AirPods và Beats; thu tài liệu chính thức, snapshot, trích văn bản, chia đoạn, kiểm độ phủ cho 2 họ pilot.</w:t>
             </w:r>
           </w:p>
         </w:tc>
@@ -3343,7 +3383,7 @@
                 <w:szCs w:val="26"/>
                 <w:rtl w:val="0"/>
               </w:rPr>
-              <w:t xml:space="preserve">Cài BM25, trích xuất σ, SAV, B0/B1, kiểm rò nhãn, runner; chạy pilot; chốt quy mô.</w:t>
+              <w:t xml:space="preserve">Cài BM25, trích xuất σ có neo nguồn, bộ quyết định, B0/B1/B2, kiểm rò nhãn, runner; chạy pilot; chốt quy mô.</w:t>
             </w:r>
           </w:p>
         </w:tc>
@@ -3928,7 +3968,7 @@
                 <w:szCs w:val="26"/>
                 <w:rtl w:val="0"/>
               </w:rPr>
-              <w:t xml:space="preserve">Không thu được tài liệu hãng thứ hai hoặc tổng số họ &lt; 6: thu hẹp kết luận về tài liệu Apple, giữ RQ2–RQ3 và tập chẩn đoán.</w:t>
+              <w:t xml:space="preserve">Hãng thứ hai là Beats (trang chính thức riêng) nên nguồn chắc chắn có; giới hạn “hai thương hiệu cùng tập đoàn” được ghi rõ. Nếu tổng số họ &lt; 6: giữ RQ2–RQ3 và tập chẩn đoán, hạ mức kết luận.</w:t>
             </w:r>
           </w:p>
         </w:tc>
@@ -4022,7 +4062,7 @@
                 <w:szCs w:val="26"/>
                 <w:rtl w:val="0"/>
               </w:rPr>
-              <w:t xml:space="preserve">Trích xuất lỗi nhiều: sửa prompt/schema hoặc đổi mô hình trên dev trước khi khóa; TN4 tách ảnh hưởng của trích xuất.</w:t>
+              <w:t xml:space="preserve">Trích xuất lỗi nhiều: kiểm neo loại dữ kiện bịa; nếu tỷ lệ loại &gt; 20% trên dev thì sửa prompt/schema trước khi khóa (không nới kiểm neo); TN4 tách phần ảnh hưởng còn lại.</w:t>
             </w:r>
           </w:p>
         </w:tc>

</xml_diff>